<commit_message>
Typeset 6-8 page IEEE-style conference paper (PDF) with exact page fitting
- paper_builder.py: two-column IEEE layout (ReportLab), tables, reserved author boxes, real page count
- Depth-aware, evidence-only drafting: background, themes, comparison/coverage tables, evaluation protocol,
  threats to validity; methods/results stay marked author placeholders (no invented content)
- Reading list sized to the venue; fit_depth() fits the venue page range; thin evidence is reported, not padded
- Clean JATS tags / non-English abstracts; keep acronyms in titles
- App: page range inputs, paper length metrics, PDF download; test for page-range fitting; docs + sheet updated

Co-Authored-By: Claude Sonnet 5.5 <noreply@anthropic.com>
Claude-Session: https://claude.ai/code/session_01JaDTkstHa53fFTEKxpEhkm
</commit_message>
<xml_diff>
--- a/docs/AAI_26ECAC401_Lab_Worklet_Review_Sheet_Filled.docx
+++ b/docs/AAI_26ECAC401_Lab_Worklet_Review_Sheet_Filled.docx
@@ -3855,7 +3855,23 @@
               <w:rPr>
                 <w:rtl w:val="0"/>
               </w:rPr>
-              <w:t xml:space="preserve"> assembles title, authors, abstract, sections and numbered references into the venue-styled document that the faculty member reviews.</w:t>
+              <w:t xml:space="preserve"> assembles title, authors, abstract, sections and numbered references into the venue-styled document that the faculty member reviews. </w:t>
+            </w:r>
+            <w:r>
+              <w:rPr>
+                <w:b w:val="1"/>
+                <w:bCs w:val="1"/>
+                <w:i w:val="1"/>
+                <w:iCs w:val="1"/>
+                <w:rtl w:val="0"/>
+              </w:rPr>
+              <w:t xml:space="preserve">paper_builder.py</w:t>
+            </w:r>
+            <w:r>
+              <w:rPr>
+                <w:rtl w:val="0"/>
+              </w:rPr>
+              <w:t xml:space="preserve"> then typesets it as an IEEE-style two-column PDF and fits it to the venue page range (for example 6-8 pages) without inventing content: empty labelled boxes are reserved for the authors' own figures, methods and results.</w:t>
             </w:r>
           </w:p>
           <w:p>
@@ -12967,7 +12983,7 @@
               <w:rPr>
                 <w:rtl w:val="0"/>
               </w:rPr>
-              <w:t xml:space="preserve"> unit suite (25 tests) as the regression layer</w:t>
+              <w:t xml:space="preserve"> unit suite (26 tests) as the regression layer</w:t>
             </w:r>
           </w:p>
         </w:tc>
@@ -16346,7 +16362,7 @@
               <w:rPr>
                 <w:rtl w:val="0"/>
               </w:rPr>
-              <w:t xml:space="preserve"> (25 tests)</w:t>
+              <w:t xml:space="preserve"> (26 tests)</w:t>
             </w:r>
           </w:p>
         </w:tc>
@@ -16617,6 +16633,22 @@
               <w:rPr>
                 <w:rtl w:val="0"/>
               </w:rPr>
+              <w:t xml:space="preserve">, </w:t>
+            </w:r>
+            <w:r>
+              <w:rPr>
+                <w:b w:val="1"/>
+                <w:bCs w:val="1"/>
+                <w:i w:val="1"/>
+                <w:iCs w:val="1"/>
+                <w:rtl w:val="0"/>
+              </w:rPr>
+              <w:t xml:space="preserve">test_radar_monitor_continuous</w:t>
+            </w:r>
+            <w:r>
+              <w:rPr>
+                <w:rtl w:val="0"/>
+              </w:rPr>
               <w:t xml:space="preserve"> and </w:t>
             </w:r>
             <w:r>
@@ -16627,13 +16659,13 @@
                 <w:iCs w:val="1"/>
                 <w:rtl w:val="0"/>
               </w:rPr>
-              <w:t xml:space="preserve">test_radar_monitor_continuous</w:t>
-            </w:r>
-            <w:r>
-              <w:rPr>
-                <w:rtl w:val="0"/>
-              </w:rPr>
-              <w:t xml:space="preserve">; </w:t>
+              <w:t xml:space="preserve">test_paper_fits_venue_page_range</w:t>
+            </w:r>
+            <w:r>
+              <w:rPr>
+                <w:rtl w:val="0"/>
+              </w:rPr>
+              <w:t xml:space="preserve"> (typeset PDF within the venue's page range); </w:t>
             </w:r>
             <w:r>
               <w:rPr>
@@ -16649,7 +16681,7 @@
               <w:rPr>
                 <w:rtl w:val="0"/>
               </w:rPr>
-              <w:t xml:space="preserve"> runs all 25 tests (all pass).</w:t>
+              <w:t xml:space="preserve"> runs all 26 tests (all pass).</w:t>
             </w:r>
           </w:p>
           <w:p>

</xml_diff>